<commit_message>
Formulations plus inclusives pour trois questions des modules 1 et 2
Co-Authored-By: Claude Opus 5.5 <noreply@anthropic.com>
Claude-Session: https://claude.ai/code/session_01Wc4SXuACyoyoBwyWVE8mxS
</commit_message>
<xml_diff>
--- a/docs/questions-par-module.docx
+++ b/docs/questions-par-module.docx
@@ -182,7 +182,7 @@
         <w:spacing w:after="100" w:before="100"/>
       </w:pPr>
       <w:r>
-        <w:t xml:space="preserve">À ton avis, quel chiffre l'autre donnerait-il à son propre niveau de bonheur, là maintenant ?</w:t>
+        <w:t xml:space="preserve">À ton avis, quel chiffre l'autre donnerait à son propre niveau de bonheur, là maintenant ?</w:t>
       </w:r>
     </w:p>
     <w:p>
@@ -379,7 +379,7 @@
         <w:spacing w:after="100" w:before="100"/>
       </w:pPr>
       <w:r>
-        <w:t xml:space="preserve">Qu'est-ce qui t'a séduit chez l'autre, la toute première fois ?</w:t>
+        <w:t xml:space="preserve">Qu'est-ce qui t'a plu chez l'autre, la toute première fois ?</w:t>
       </w:r>
     </w:p>
     <w:p>
@@ -444,7 +444,7 @@
         <w:spacing w:after="100" w:before="100"/>
       </w:pPr>
       <w:r>
-        <w:t xml:space="preserve">Comment vos amis proches décrivent votre couple ?</w:t>
+        <w:t xml:space="preserve">Comment vos proches décrivent votre couple ?</w:t>
       </w:r>
     </w:p>
     <w:p>

</xml_diff>

<commit_message>
Module 7 : retire une question, en ajoute une et reformule trois questions
Co-Authored-By: Claude Opus 5.5 <noreply@anthropic.com>
Claude-Session: https://claude.ai/code/session_01Wc4SXuACyoyoBwyWVE8mxS
</commit_message>
<xml_diff>
--- a/docs/questions-par-module.docx
+++ b/docs/questions-par-module.docx
@@ -3983,7 +3983,7 @@
         <w:spacing w:after="100" w:before="100"/>
       </w:pPr>
       <w:r>
-        <w:t xml:space="preserve">Y a-t-il une marque d'attention de l'autre que tu as mis du temps à remarquer ?</w:t>
+        <w:t xml:space="preserve">Tendresse en public, tendresse en privé : où se situe ton curseur ?</w:t>
       </w:r>
     </w:p>
     <w:p>
@@ -3996,7 +3996,7 @@
         <w:spacing w:after="100" w:before="100"/>
       </w:pPr>
       <w:r>
-        <w:t xml:space="preserve">Tendresse en public, tendresse en privé : où se situe ton curseur ?</w:t>
+        <w:t xml:space="preserve">À quels moments ressens-tu le plus le besoin d'être proche de l'autre (après une journée difficile, le matin, le week-end…) ?</w:t>
       </w:r>
     </w:p>
     <w:p>
@@ -4009,7 +4009,7 @@
         <w:spacing w:after="100" w:before="100"/>
       </w:pPr>
       <w:r>
-        <w:t xml:space="preserve">À quels moments ressens-tu le plus le besoin d'être proche de l'autre (après une journée difficile, le matin, le week-end…) ?</w:t>
+        <w:t xml:space="preserve">Que se passe-t-il en toi quand ton besoin de connexion et de contact physique n'est pas comblé ? Et comment ça se voit de l'extérieur ?</w:t>
       </w:r>
     </w:p>
     <w:p>
@@ -4022,7 +4022,7 @@
         <w:spacing w:after="100" w:before="100"/>
       </w:pPr>
       <w:r>
-        <w:t xml:space="preserve">Que se passe-t-il en toi quand ce besoin de connexion n'est pas comblé ? Et comment ça se voit de l'extérieur ?</w:t>
+        <w:t xml:space="preserve">Arrivez-vous à en parler ? Comment pourrais-tu le dire à l'autre, la prochaine fois ?</w:t>
       </w:r>
     </w:p>
     <w:p>
@@ -4035,7 +4035,7 @@
         <w:spacing w:after="100" w:before="100"/>
       </w:pPr>
       <w:r>
-        <w:t xml:space="preserve">Arrivez-vous à en parler ? Comment pourrais-tu le dire à l'autre, la prochaine fois ?</w:t>
+        <w:t xml:space="preserve">Quel moment de grande complicité gardes-tu précieusement en mémoire ?</w:t>
       </w:r>
     </w:p>
     <w:p>
@@ -4048,7 +4048,7 @@
         <w:spacing w:after="100" w:before="100"/>
       </w:pPr>
       <w:r>
-        <w:t xml:space="preserve">Quel moment de grande complicité gardes-tu précieusement en mémoire ?</w:t>
+        <w:t xml:space="preserve">Qu'est-ce qui nourrit ton désir : la complicité, l'humour, un regard, le physique, la surprise… ?</w:t>
       </w:r>
     </w:p>
     <w:p>
@@ -4061,7 +4061,7 @@
         <w:spacing w:after="100" w:before="100"/>
       </w:pPr>
       <w:r>
-        <w:t xml:space="preserve">Au-delà du physique, qu'est-ce qui nourrit ton désir : la complicité, l'humour, un regard, la surprise… ?</w:t>
+        <w:t xml:space="preserve">Te sens-tu à l'aise pour exprimer tes envies et tes limites dans votre sexualité ? Qu'est-ce qui rendrait ça plus facile ?</w:t>
       </w:r>
     </w:p>
     <w:p>
@@ -4074,7 +4074,7 @@
         <w:spacing w:after="100" w:before="100"/>
       </w:pPr>
       <w:r>
-        <w:t xml:space="preserve">Te sens-tu à l'aise pour exprimer tes envies et tes limites dans votre sexualité ? Qu'est-ce qui rendrait ça plus facile ?</w:t>
+        <w:t xml:space="preserve">Sur une échelle de 1 à 10, comment te sens-tu dans votre vie intime en ce moment ? Qu'est-ce qui la ferait gagner un point ?</w:t>
       </w:r>
     </w:p>
     <w:p>
@@ -4087,7 +4087,7 @@
         <w:spacing w:after="100" w:before="100"/>
       </w:pPr>
       <w:r>
-        <w:t xml:space="preserve">Sur une échelle de 1 à 10, comment te sens-tu dans votre vie intime en ce moment ? Qu'est-ce qui la ferait gagner un point ?</w:t>
+        <w:t xml:space="preserve">Qu'est-ce qui freine parfois l'intimité entre vous : fatigue, rythme, enfants, écrans, stress… ?</w:t>
       </w:r>
     </w:p>
     <w:p>
@@ -4100,7 +4100,7 @@
         <w:spacing w:after="100" w:before="100"/>
       </w:pPr>
       <w:r>
-        <w:t xml:space="preserve">Qu'est-ce qui freine parfois l'intimité entre vous : fatigue, rythme, enfants, écrans, stress… ?</w:t>
+        <w:t xml:space="preserve">Qu'est-ce que vous aimeriez changer dans votre manière de faire l'amour ?</w:t>
       </w:r>
     </w:p>
     <w:p>
@@ -4113,7 +4113,7 @@
         <w:spacing w:after="100" w:before="100"/>
       </w:pPr>
       <w:r>
-        <w:t xml:space="preserve">Y a-t-il une envie, une nouveauté ou un petit rituel de tendresse que tu aimerais proposer ?</w:t>
+        <w:t xml:space="preserve">Y a-t-il une envie, une nouveauté ou un petit rituel que tu aimerais proposer ?</w:t>
       </w:r>
     </w:p>
     <w:p>

</xml_diff>

<commit_message>
Module 7 : retire les questions « en parler » et « moment de complicité »
Co-Authored-By: Claude Opus 5.5 <noreply@anthropic.com>
Claude-Session: https://claude.ai/code/session_01Wc4SXuACyoyoBwyWVE8mxS
</commit_message>
<xml_diff>
--- a/docs/questions-par-module.docx
+++ b/docs/questions-par-module.docx
@@ -35,7 +35,7 @@
           <w:sz w:val="20"/>
           <w:szCs w:val="20"/>
         </w:rPr>
-        <w:t xml:space="preserve">10 modules · 122 questions, plus 2 questions de fin par module. Contenu de référence tiré du code de l’application (src/lib/modules-data.ts) ; les modifications faites depuis l’espace admin ne sont pas incluses.</w:t>
+        <w:t xml:space="preserve">10 modules · 120 questions, plus 2 questions de fin par module. Contenu de référence tiré du code de l’application (src/lib/modules-data.ts) ; les modifications faites depuis l’espace admin ne sont pas incluses.</w:t>
       </w:r>
     </w:p>
     <w:p>
@@ -3931,7 +3931,7 @@
         <w:pStyle w:val="Heading2"/>
       </w:pPr>
       <w:r>
-        <w:t xml:space="preserve">Questions (14)</w:t>
+        <w:t xml:space="preserve">Questions (12)</w:t>
       </w:r>
     </w:p>
     <w:p>
@@ -4010,32 +4010,6 @@
       </w:pPr>
       <w:r>
         <w:t xml:space="preserve">Que se passe-t-il en toi quand ton besoin de connexion et de contact physique n'est pas comblé ? Et comment ça se voit de l'extérieur ?</w:t>
-      </w:r>
-    </w:p>
-    <w:p>
-      <w:pPr>
-        <w:pStyle w:val="ListParagraph"/>
-        <w:numPr>
-          <w:ilvl w:val="0"/>
-          <w:numId w:val="9"/>
-        </w:numPr>
-        <w:spacing w:after="100" w:before="100"/>
-      </w:pPr>
-      <w:r>
-        <w:t xml:space="preserve">Arrivez-vous à en parler ? Comment pourrais-tu le dire à l'autre, la prochaine fois ?</w:t>
-      </w:r>
-    </w:p>
-    <w:p>
-      <w:pPr>
-        <w:pStyle w:val="ListParagraph"/>
-        <w:numPr>
-          <w:ilvl w:val="0"/>
-          <w:numId w:val="9"/>
-        </w:numPr>
-        <w:spacing w:after="100" w:before="100"/>
-      </w:pPr>
-      <w:r>
-        <w:t xml:space="preserve">Quel moment de grande complicité gardes-tu précieusement en mémoire ?</w:t>
       </w:r>
     </w:p>
     <w:p>

</xml_diff>

<commit_message>
Module 7 : réordonne les questions et simplifie celle sur les envies
Co-Authored-By: Claude Opus 5.5 <noreply@anthropic.com>
Claude-Session: https://claude.ai/code/session_01Wc4SXuACyoyoBwyWVE8mxS
</commit_message>
<xml_diff>
--- a/docs/questions-par-module.docx
+++ b/docs/questions-par-module.docx
@@ -4035,7 +4035,7 @@
         <w:spacing w:after="100" w:before="100"/>
       </w:pPr>
       <w:r>
-        <w:t xml:space="preserve">Te sens-tu à l'aise pour exprimer tes envies et tes limites dans votre sexualité ? Qu'est-ce qui rendrait ça plus facile ?</w:t>
+        <w:t xml:space="preserve">Sur une échelle de 1 à 10, comment te sens-tu dans votre vie intime en ce moment ? Qu'est-ce qui la ferait gagner un point ?</w:t>
       </w:r>
     </w:p>
     <w:p>
@@ -4048,7 +4048,7 @@
         <w:spacing w:after="100" w:before="100"/>
       </w:pPr>
       <w:r>
-        <w:t xml:space="preserve">Sur une échelle de 1 à 10, comment te sens-tu dans votre vie intime en ce moment ? Qu'est-ce qui la ferait gagner un point ?</w:t>
+        <w:t xml:space="preserve">Qu'est-ce qui freine parfois l'intimité entre vous : fatigue, rythme, enfants, écrans, stress… ?</w:t>
       </w:r>
     </w:p>
     <w:p>
@@ -4061,7 +4061,7 @@
         <w:spacing w:after="100" w:before="100"/>
       </w:pPr>
       <w:r>
-        <w:t xml:space="preserve">Qu'est-ce qui freine parfois l'intimité entre vous : fatigue, rythme, enfants, écrans, stress… ?</w:t>
+        <w:t xml:space="preserve">Te sens-tu à l'aise pour exprimer tes envies dans votre sexualité ?</w:t>
       </w:r>
     </w:p>
     <w:p>

</xml_diff>

<commit_message>
Module 7 : nouvelles questions de fin de module
Co-Authored-By: Claude Opus 5.5 <noreply@anthropic.com>
Claude-Session: https://claude.ai/code/session_01Wc4SXuACyoyoBwyWVE8mxS
</commit_message>
<xml_diff>
--- a/docs/questions-par-module.docx
+++ b/docs/questions-par-module.docx
@@ -4109,7 +4109,7 @@
         <w:spacing w:after="100"/>
       </w:pPr>
       <w:r>
-        <w:t xml:space="preserve">Qu'as-tu compris de la façon dont l'autre a besoin de recevoir l'amour ?</w:t>
+        <w:t xml:space="preserve">Que retiens-tu des besoins de l'autre en termes de tendresse au quotidien ?</w:t>
       </w:r>
     </w:p>
     <w:p>
@@ -4122,7 +4122,7 @@
         <w:spacing w:after="100"/>
       </w:pPr>
       <w:r>
-        <w:t xml:space="preserve">Dans votre intimité, qu'aimerais-tu préserver, et qu'aimerais-tu voir évoluer ?</w:t>
+        <w:t xml:space="preserve">Que voulez-vous garder, arrêter ou changer dans vos rapports sexuels aujourd'hui ?</w:t>
       </w:r>
     </w:p>
     <w:p>

</xml_diff>

<commit_message>
Module 7 : ajoute la question sur le geste ou code de rapprochement
Co-Authored-By: Claude Opus 5.5 <noreply@anthropic.com>
Claude-Session: https://claude.ai/code/session_01Wc4SXuACyoyoBwyWVE8mxS
</commit_message>
<xml_diff>
--- a/docs/questions-par-module.docx
+++ b/docs/questions-par-module.docx
@@ -35,7 +35,7 @@
           <w:sz w:val="20"/>
           <w:szCs w:val="20"/>
         </w:rPr>
-        <w:t xml:space="preserve">10 modules · 120 questions, plus 2 questions de fin par module. Contenu de référence tiré du code de l’application (src/lib/modules-data.ts) ; les modifications faites depuis l’espace admin ne sont pas incluses.</w:t>
+        <w:t xml:space="preserve">10 modules · 121 questions, plus 2 questions de fin par module. Contenu de référence tiré du code de l’application (src/lib/modules-data.ts) ; les modifications faites depuis l’espace admin ne sont pas incluses.</w:t>
       </w:r>
     </w:p>
     <w:p>
@@ -3931,7 +3931,7 @@
         <w:pStyle w:val="Heading2"/>
       </w:pPr>
       <w:r>
-        <w:t xml:space="preserve">Questions (12)</w:t>
+        <w:t xml:space="preserve">Questions (13)</w:t>
       </w:r>
     </w:p>
     <w:p>
@@ -4075,6 +4075,19 @@
       </w:pPr>
       <w:r>
         <w:t xml:space="preserve">Qu'est-ce que vous aimez le moins aujourd'hui dans votre manière de faire l'amour ?</w:t>
+      </w:r>
+    </w:p>
+    <w:p>
+      <w:pPr>
+        <w:pStyle w:val="ListParagraph"/>
+        <w:numPr>
+          <w:ilvl w:val="0"/>
+          <w:numId w:val="9"/>
+        </w:numPr>
+        <w:spacing w:after="100" w:before="100"/>
+      </w:pPr>
+      <w:r>
+        <w:t xml:space="preserve">Par quel petit geste ou code pourrais-tu signifier à l'autre que tu as envie d'un rapprochement physique ?</w:t>
       </w:r>
     </w:p>
     <w:p>

</xml_diff>